<commit_message>
Fix forwarder tail loop and add agent tests
</commit_message>
<xml_diff>
--- a/docs/05-test-plan-and-results.docx
+++ b/docs/05-test-plan-and-results.docx
@@ -3628,13 +3628,25 @@
           <w:bCs/>
           <w:b/>
         </w:rPr>
-        <w:t xml:space="preserve">A defect this test exposed.</w:t>
-      </w:r>
-      <w:r>
-        <w:t xml:space="preserve"> </w:t>
-      </w:r>
-      <w:r>
-        <w:t xml:space="preserve">The forwarder was written to send four patterns, including</w:t>
+        <w:t xml:space="preserve">Two defects this test exposed.</w:t>
+      </w:r>
+    </w:p>
+    <w:p>
+      <w:pPr>
+        <w:pStyle w:val="BodyText"/>
+      </w:pPr>
+      <w:r>
+        <w:rPr>
+          <w:iCs/>
+          <w:i/>
+        </w:rPr>
+        <w:t xml:space="preserve">The forwarder crashed on the first line it tried to forward.</w:t>
+      </w:r>
+      <w:r>
+        <w:t xml:space="preserve"> </w:t>
+      </w:r>
+      <w:r>
+        <w:t xml:space="preserve">The tail loop iterated the file with</w:t>
       </w:r>
       <w:r>
         <w:t xml:space="preserve"> </w:t>
@@ -3643,6 +3655,151 @@
         <w:rPr>
           <w:rStyle w:val="VerbatimChar"/>
         </w:rPr>
+        <w:t xml:space="preserve">for line in fh</w:t>
+      </w:r>
+      <w:r>
+        <w:t xml:space="preserve"> </w:t>
+      </w:r>
+      <w:r>
+        <w:t xml:space="preserve">and called</w:t>
+      </w:r>
+      <w:r>
+        <w:t xml:space="preserve"> </w:t>
+      </w:r>
+      <w:r>
+        <w:rPr>
+          <w:rStyle w:val="VerbatimChar"/>
+        </w:rPr>
+        <w:t xml:space="preserve">fh.tell()</w:t>
+      </w:r>
+      <w:r>
+        <w:t xml:space="preserve"> </w:t>
+      </w:r>
+      <w:r>
+        <w:t xml:space="preserve">inside it to record its offset. Python disallows that combination, because the iterator reads ahead in blocks and the position</w:t>
+      </w:r>
+      <w:r>
+        <w:t xml:space="preserve"> </w:t>
+      </w:r>
+      <w:r>
+        <w:rPr>
+          <w:rStyle w:val="VerbatimChar"/>
+        </w:rPr>
+        <w:t xml:space="preserve">tell()</w:t>
+      </w:r>
+      <w:r>
+        <w:t xml:space="preserve"> </w:t>
+      </w:r>
+      <w:r>
+        <w:t xml:space="preserve">would report is not the position after the current line. It raises</w:t>
+      </w:r>
+      <w:r>
+        <w:t xml:space="preserve"> </w:t>
+      </w:r>
+      <w:r>
+        <w:rPr>
+          <w:rStyle w:val="VerbatimChar"/>
+        </w:rPr>
+        <w:t xml:space="preserve">OSError: telling position disabled by next() call</w:t>
+      </w:r>
+      <w:r>
+        <w:t xml:space="preserve">.</w:t>
+      </w:r>
+    </w:p>
+    <w:p>
+      <w:pPr>
+        <w:pStyle w:val="BodyText"/>
+      </w:pPr>
+      <w:r>
+        <w:t xml:space="preserve">The failure mode was quiet in the worst way. The agent started, logged that it was watching the file and which endpoint it would post to, then died on the first match. systemd restarted it, and it repeated. By the time this test ran the restart counter had reached 371. Every log line said the agent was working; the service status said</w:t>
+      </w:r>
+      <w:r>
+        <w:t xml:space="preserve"> </w:t>
+      </w:r>
+      <w:r>
+        <w:rPr>
+          <w:rStyle w:val="VerbatimChar"/>
+        </w:rPr>
+        <w:t xml:space="preserve">activating</w:t>
+      </w:r>
+      <w:r>
+        <w:t xml:space="preserve"> </w:t>
+      </w:r>
+      <w:r>
+        <w:t xml:space="preserve">rather than</w:t>
+      </w:r>
+      <w:r>
+        <w:t xml:space="preserve"> </w:t>
+      </w:r>
+      <w:r>
+        <w:rPr>
+          <w:rStyle w:val="VerbatimChar"/>
+        </w:rPr>
+        <w:t xml:space="preserve">active</w:t>
+      </w:r>
+      <w:r>
+        <w:t xml:space="preserve">, which is the only visible difference and is easy to read past.</w:t>
+      </w:r>
+    </w:p>
+    <w:p>
+      <w:pPr>
+        <w:pStyle w:val="BodyText"/>
+      </w:pPr>
+      <w:r>
+        <w:t xml:space="preserve">Fixed by reading with</w:t>
+      </w:r>
+      <w:r>
+        <w:t xml:space="preserve"> </w:t>
+      </w:r>
+      <w:r>
+        <w:rPr>
+          <w:rStyle w:val="VerbatimChar"/>
+        </w:rPr>
+        <w:t xml:space="preserve">readline()</w:t>
+      </w:r>
+      <w:r>
+        <w:t xml:space="preserve"> </w:t>
+      </w:r>
+      <w:r>
+        <w:t xml:space="preserve">in a while loop, which does not disable</w:t>
+      </w:r>
+      <w:r>
+        <w:t xml:space="preserve"> </w:t>
+      </w:r>
+      <w:r>
+        <w:rPr>
+          <w:rStyle w:val="VerbatimChar"/>
+        </w:rPr>
+        <w:t xml:space="preserve">tell()</w:t>
+      </w:r>
+      <w:r>
+        <w:t xml:space="preserve">. The agent had no tests at all, which is why a defect this basic reached deployment. Nine tests were added that exercise the real tail loop against a real file, covering the regression itself, offset persistence across restarts, rotation handling, and partial lines.</w:t>
+      </w:r>
+    </w:p>
+    <w:p>
+      <w:pPr>
+        <w:pStyle w:val="BodyText"/>
+      </w:pPr>
+      <w:r>
+        <w:rPr>
+          <w:iCs/>
+          <w:i/>
+        </w:rPr>
+        <w:t xml:space="preserve">The forwarder and the collector disagreed about what an SSH failure looks like.</w:t>
+      </w:r>
+      <w:r>
+        <w:t xml:space="preserve"> </w:t>
+      </w:r>
+      <w:r>
+        <w:t xml:space="preserve">The forwarder sends four patterns including</w:t>
+      </w:r>
+      <w:r>
+        <w:t xml:space="preserve"> </w:t>
+      </w:r>
+      <w:r>
+        <w:rPr>
+          <w:rStyle w:val="VerbatimChar"/>
+        </w:rPr>
         <w:t xml:space="preserve">Invalid user</w:t>
       </w:r>
       <w:r>
@@ -3673,7 +3830,7 @@
         <w:t xml:space="preserve">Failed publickey</w:t>
       </w:r>
       <w:r>
-        <w:t xml:space="preserve">. Invalid-user events therefore arrived, fell through to</w:t>
+        <w:t xml:space="preserve">. Invalid-user events arrived, fell through to</w:t>
       </w:r>
       <w:r>
         <w:t xml:space="preserve"> </w:t>
@@ -3685,7 +3842,7 @@
         <w:t xml:space="preserve">syslog_generic</w:t>
       </w:r>
       <w:r>
-        <w:t xml:space="preserve">, lost their source address, and matched no playbook. The two components disagreed about what an SSH authentication failure looks like, and nothing failed loudly: events were ingested and stored, they simply never did anything.</w:t>
+        <w:t xml:space="preserve">, lost their source address, and matched no playbook. Nothing failed loudly: events were ingested and stored, they simply never did anything.</w:t>
       </w:r>
     </w:p>
     <w:p>
@@ -3693,7 +3850,25 @@
         <w:pStyle w:val="BodyText"/>
       </w:pPr>
       <w:r>
-        <w:t xml:space="preserve">Fixed by adding the missing patterns to the collector, and guarded by a unit test that asserts every pattern the forwarder sends is classified by the collector, so the contract between the two cannot drift again.</w:t>
+        <w:t xml:space="preserve">Fixed by adding the missing patterns, and guarded by a test asserting that every pattern the forwarder sends is classified by the collector, so the contract cannot drift again.</w:t>
+      </w:r>
+    </w:p>
+    <w:p>
+      <w:pPr>
+        <w:pStyle w:val="BodyText"/>
+      </w:pPr>
+      <w:r>
+        <w:rPr>
+          <w:bCs/>
+          <w:b/>
+        </w:rPr>
+        <w:t xml:space="preserve">What links them.</w:t>
+      </w:r>
+      <w:r>
+        <w:t xml:space="preserve"> </w:t>
+      </w:r>
+      <w:r>
+        <w:t xml:space="preserve">Both were failures of the gap between two components rather than of either component alone, and neither produced an error anywhere an operator would look. The forwarder is the only part of this system that runs unattended on a host nobody logs into, and it was the only part with no tests. That correlation is not a coincidence.</w:t>
       </w:r>
     </w:p>
     <w:p>

</xml_diff>

<commit_message>
Fix Alertmanager receiver reference and verify components are present, not just healthy
</commit_message>
<xml_diff>
--- a/docs/05-test-plan-and-results.docx
+++ b/docs/05-test-plan-and-results.docx
@@ -211,7 +211,7 @@
         <w:t xml:space="preserve"> </w:t>
       </w:r>
       <w:r>
-        <w:t xml:space="preserve">does each component do what it is supposed to?</w:t>
+        <w:t xml:space="preserve">Does each component do what it is supposed to?</w:t>
       </w:r>
     </w:p>
     <w:p>
@@ -233,7 +233,7 @@
         <w:t xml:space="preserve"> </w:t>
       </w:r>
       <w:r>
-        <w:t xml:space="preserve">does an event travel the whole path and change the environment?</w:t>
+        <w:t xml:space="preserve">Does an event travel the whole path and change the environment?</w:t>
       </w:r>
     </w:p>
     <w:p>
@@ -255,7 +255,7 @@
         <w:t xml:space="preserve"> </w:t>
       </w:r>
       <w:r>
-        <w:t xml:space="preserve">what happens when something breaks?</w:t>
+        <w:t xml:space="preserve">What happens when something breaks?</w:t>
       </w:r>
     </w:p>
     <w:p>
@@ -4914,7 +4914,7 @@
     </w:p>
     <w:bookmarkEnd w:id="71"/>
     <w:bookmarkEnd w:id="72"/>
-    <w:bookmarkStart w:id="83" w:name="resilience-tests"/>
+    <w:bookmarkStart w:id="84" w:name="resilience-tests"/>
     <w:p>
       <w:pPr>
         <w:pStyle w:val="Heading1"/>
@@ -6819,140 +6819,31 @@
       </w:r>
     </w:p>
     <w:bookmarkEnd w:id="82"/>
-    <w:bookmarkEnd w:id="83"/>
-    <w:bookmarkStart w:id="88" w:name="findings"/>
-    <w:p>
-      <w:pPr>
-        <w:pStyle w:val="Heading1"/>
-      </w:pPr>
-      <w:r>
-        <w:t xml:space="preserve">6. Findings</w:t>
-      </w:r>
-    </w:p>
-    <w:bookmarkStart w:id="84" w:name="Xfdb6ed71c42ae54ad0981a45c4700a6260775ac"/>
+    <w:bookmarkStart w:id="83" w:name="Xa7937dfd8bc84d36f5348383683a925775f3489"/>
     <w:p>
       <w:pPr>
         <w:pStyle w:val="Heading2"/>
       </w:pPr>
       <w:r>
-        <w:t xml:space="preserve">6.1 Read permissions do not imply write permissions</w:t>
+        <w:t xml:space="preserve">5.8 R-08. Alertmanager silently absent behind a green pipeline</w:t>
       </w:r>
     </w:p>
     <w:p>
       <w:pPr>
         <w:pStyle w:val="FirstParagraph"/>
-      </w:pPr>
-      <w:r>
-        <w:t xml:space="preserve">The capability probe tested</w:t>
-      </w:r>
-      <w:r>
-        <w:t xml:space="preserve"> </w:t>
-      </w:r>
-      <w:r>
-        <w:rPr>
-          <w:rStyle w:val="VerbatimChar"/>
-        </w:rPr>
-        <w:t xml:space="preserve">Describe*</w:t>
-      </w:r>
-      <w:r>
-        <w:t xml:space="preserve"> </w:t>
-      </w:r>
-      <w:r>
-        <w:t xml:space="preserve">actions and inferred service availability. The SCP denies</w:t>
-      </w:r>
-      <w:r>
-        <w:t xml:space="preserve"> </w:t>
-      </w:r>
-      <w:r>
-        <w:rPr>
-          <w:rStyle w:val="VerbatimChar"/>
-        </w:rPr>
-        <w:t xml:space="preserve">rds:CreateDBInstance</w:t>
-      </w:r>
-      <w:r>
-        <w:t xml:space="preserve"> </w:t>
-      </w:r>
-      <w:r>
-        <w:t xml:space="preserve">while permitting</w:t>
-      </w:r>
-      <w:r>
-        <w:t xml:space="preserve"> </w:t>
-      </w:r>
-      <w:r>
-        <w:rPr>
-          <w:rStyle w:val="VerbatimChar"/>
-        </w:rPr>
-        <w:t xml:space="preserve">rds:DescribeDBInstances</w:t>
-      </w:r>
-      <w:r>
-        <w:t xml:space="preserve">, so RDS appeared available and was not.</w:t>
-      </w:r>
-    </w:p>
-    <w:p>
-      <w:pPr>
-        <w:pStyle w:val="BodyText"/>
-      </w:pPr>
-      <w:r>
-        <w:t xml:space="preserve">Discovered mid-deployment, costing an unplanned redesign of the data layer.</w:t>
-      </w:r>
-    </w:p>
-    <w:p>
-      <w:pPr>
-        <w:pStyle w:val="BodyText"/>
       </w:pPr>
       <w:r>
         <w:rPr>
           <w:bCs/>
           <w:b/>
         </w:rPr>
-        <w:t xml:space="preserve">Lesson.</w:t>
-      </w:r>
-      <w:r>
-        <w:t xml:space="preserve"> </w:t>
-      </w:r>
-      <w:r>
-        <w:t xml:space="preserve">Probe with the action you intend to use.</w:t>
-      </w:r>
-      <w:r>
-        <w:t xml:space="preserve"> </w:t>
-      </w:r>
-      <w:r>
-        <w:rPr>
-          <w:rStyle w:val="VerbatimChar"/>
-        </w:rPr>
-        <w:t xml:space="preserve">--dry-run</w:t>
-      </w:r>
-      <w:r>
-        <w:t xml:space="preserve"> </w:t>
-      </w:r>
-      <w:r>
-        <w:t xml:space="preserve">where the API supports it; a create-then-delete probe where it does not. This was subsequently applied to Transit Gateway, VPC and Elastic IP creation before relying on any of them.</w:t>
-      </w:r>
-    </w:p>
-    <w:bookmarkEnd w:id="84"/>
-    <w:bookmarkStart w:id="85" w:name="X238f44773f54e3893890ae9e8b0ffa8c4ec93d3"/>
-    <w:p>
-      <w:pPr>
-        <w:pStyle w:val="Heading2"/>
-      </w:pPr>
-      <w:r>
-        <w:t xml:space="preserve">6.2 A constraint produced a better architecture</w:t>
-      </w:r>
-    </w:p>
-    <w:p>
-      <w:pPr>
-        <w:pStyle w:val="FirstParagraph"/>
-      </w:pPr>
-      <w:r>
-        <w:t xml:space="preserve">The RDS denial forced monitoring data onto S3 and SOAR state onto DynamoDB.</w:t>
-      </w:r>
-    </w:p>
-    <w:p>
-      <w:pPr>
-        <w:pStyle w:val="BodyText"/>
-      </w:pPr>
-      <w:r>
-        <w:t xml:space="preserve">The result is better than the original design. Object storage is what production observability deployments actually use for retention. Durability is far higher than a single database instance, capacity planning disappears, and retention becomes a lifecycle rule. DynamoDB suits the SOAR event workload better than a relational store, because events are written once and read by key with no joins.</w:t>
+        <w:t xml:space="preserve">Not a designed test.</w:t>
+      </w:r>
+      <w:r>
+        <w:t xml:space="preserve"> </w:t>
+      </w:r>
+      <w:r>
+        <w:t xml:space="preserve">Found while capturing evidence, by counting pods in a screenshot and noticing one was missing.</w:t>
       </w:r>
     </w:p>
     <w:p>
@@ -6964,17 +6855,483 @@
           <w:bCs/>
           <w:b/>
         </w:rPr>
+        <w:t xml:space="preserve">Symptom.</w:t>
+      </w:r>
+      <w:r>
+        <w:t xml:space="preserve"> </w:t>
+      </w:r>
+      <w:r>
+        <w:t xml:space="preserve">Nine pods running in the monitoring namespace where there had previously been ten. Alertmanager was not among them. Every pipeline run had reported success.</w:t>
+      </w:r>
+    </w:p>
+    <w:p>
+      <w:pPr>
+        <w:pStyle w:val="BodyText"/>
+      </w:pPr>
+      <w:r>
+        <w:rPr>
+          <w:bCs/>
+          <w:b/>
+        </w:rPr>
+        <w:t xml:space="preserve">Root cause.</w:t>
+      </w:r>
+      <w:r>
+        <w:t xml:space="preserve"> </w:t>
+      </w:r>
+      <w:r>
+        <w:t xml:space="preserve">The chart ships a default route sending</w:t>
+      </w:r>
+      <w:r>
+        <w:t xml:space="preserve"> </w:t>
+      </w:r>
+      <w:r>
+        <w:rPr>
+          <w:rStyle w:val="VerbatimChar"/>
+        </w:rPr>
+        <w:t xml:space="preserve">Watchdog</w:t>
+      </w:r>
+      <w:r>
+        <w:t xml:space="preserve"> </w:t>
+      </w:r>
+      <w:r>
+        <w:t xml:space="preserve">and</w:t>
+      </w:r>
+      <w:r>
+        <w:t xml:space="preserve"> </w:t>
+      </w:r>
+      <w:r>
+        <w:rPr>
+          <w:rStyle w:val="VerbatimChar"/>
+        </w:rPr>
+        <w:t xml:space="preserve">InfoInhibitor</w:t>
+      </w:r>
+      <w:r>
+        <w:t xml:space="preserve"> </w:t>
+      </w:r>
+      <w:r>
+        <w:t xml:space="preserve">alerts to a receiver named</w:t>
+      </w:r>
+      <w:r>
+        <w:t xml:space="preserve"> </w:t>
+      </w:r>
+      <w:r>
+        <w:rPr>
+          <w:rStyle w:val="VerbatimChar"/>
+        </w:rPr>
+        <w:t xml:space="preserve">null</w:t>
+      </w:r>
+      <w:r>
+        <w:t xml:space="preserve">. When the Helm values were moved out of the deployment script and into versioned files, a</w:t>
+      </w:r>
+      <w:r>
+        <w:t xml:space="preserve"> </w:t>
+      </w:r>
+      <w:r>
+        <w:rPr>
+          <w:rStyle w:val="VerbatimChar"/>
+        </w:rPr>
+        <w:t xml:space="preserve">routes</w:t>
+      </w:r>
+      <w:r>
+        <w:t xml:space="preserve"> </w:t>
+      </w:r>
+      <w:r>
+        <w:t xml:space="preserve">sub-list that had been overriding that default was dropped.</w:t>
+      </w:r>
+    </w:p>
+    <w:p>
+      <w:pPr>
+        <w:pStyle w:val="BodyText"/>
+      </w:pPr>
+      <w:r>
+        <w:t xml:space="preserve">Helm replaces lists but merges maps. The replacement</w:t>
+      </w:r>
+      <w:r>
+        <w:t xml:space="preserve"> </w:t>
+      </w:r>
+      <w:r>
+        <w:rPr>
+          <w:rStyle w:val="VerbatimChar"/>
+        </w:rPr>
+        <w:t xml:space="preserve">receivers</w:t>
+      </w:r>
+      <w:r>
+        <w:t xml:space="preserve"> </w:t>
+      </w:r>
+      <w:r>
+        <w:t xml:space="preserve">list therefore removed the chart’s</w:t>
+      </w:r>
+      <w:r>
+        <w:t xml:space="preserve"> </w:t>
+      </w:r>
+      <w:r>
+        <w:rPr>
+          <w:rStyle w:val="VerbatimChar"/>
+        </w:rPr>
+        <w:t xml:space="preserve">null</w:t>
+      </w:r>
+      <w:r>
+        <w:t xml:space="preserve"> </w:t>
+      </w:r>
+      <w:r>
+        <w:t xml:space="preserve">receiver, while the chart’s route continued to reference it. The operator rejected the resulting configuration with</w:t>
+      </w:r>
+      <w:r>
+        <w:t xml:space="preserve"> </w:t>
+      </w:r>
+      <w:r>
+        <w:rPr>
+          <w:rStyle w:val="VerbatimChar"/>
+        </w:rPr>
+        <w:t xml:space="preserve">undefined receiver "null" used in route</w:t>
+      </w:r>
+      <w:r>
+        <w:t xml:space="preserve">, refused to create the StatefulSet, and Alertmanager never started.</w:t>
+      </w:r>
+    </w:p>
+    <w:p>
+      <w:pPr>
+        <w:pStyle w:val="BodyText"/>
+      </w:pPr>
+      <w:r>
+        <w:rPr>
+          <w:bCs/>
+          <w:b/>
+        </w:rPr>
+        <w:t xml:space="preserve">Why nothing caught it.</w:t>
+      </w:r>
+      <w:r>
+        <w:t xml:space="preserve"> </w:t>
+      </w:r>
+      <w:r>
+        <w:t xml:space="preserve">The verification step checked that every pod which exists is Running. Alertmanager had no pod at all, so there was nothing unhealthy to find. Absence and health are different properties, and only one of them was being checked.</w:t>
+      </w:r>
+    </w:p>
+    <w:p>
+      <w:pPr>
+        <w:pStyle w:val="BodyText"/>
+      </w:pPr>
+      <w:r>
+        <w:t xml:space="preserve">The connectivity check did not catch it either. It posts to the ingest endpoint with</w:t>
+      </w:r>
+      <w:r>
+        <w:t xml:space="preserve"> </w:t>
+      </w:r>
+      <w:r>
+        <w:rPr>
+          <w:rStyle w:val="VerbatimChar"/>
+        </w:rPr>
+        <w:t xml:space="preserve">curl</w:t>
+      </w:r>
+      <w:r>
+        <w:t xml:space="preserve"> </w:t>
+      </w:r>
+      <w:r>
+        <w:t xml:space="preserve">from the node, which proves the endpoint is reachable but bypasses Alertmanager entirely. It passes whether or not Alertmanager is running.</w:t>
+      </w:r>
+    </w:p>
+    <w:p>
+      <w:pPr>
+        <w:pStyle w:val="BodyText"/>
+      </w:pPr>
+      <w:r>
+        <w:rPr>
+          <w:bCs/>
+          <w:b/>
+        </w:rPr>
+        <w:t xml:space="preserve">Impact.</w:t>
+      </w:r>
+      <w:r>
+        <w:t xml:space="preserve"> </w:t>
+      </w:r>
+      <w:r>
+        <w:t xml:space="preserve">REQ-NCA-P2-09 was not satisfied for the period between the refactor and this discovery. Alerts generated by Prometheus had nowhere to go. The rest of the SOAR pipeline was unaffected, because the on-premises forwarder and direct submissions do not pass through Alertmanager, which is why every other test continued to pass.</w:t>
+      </w:r>
+    </w:p>
+    <w:p>
+      <w:pPr>
+        <w:pStyle w:val="BodyText"/>
+      </w:pPr>
+      <w:r>
+        <w:rPr>
+          <w:bCs/>
+          <w:b/>
+        </w:rPr>
+        <w:t xml:space="preserve">Fix, in three parts.</w:t>
+      </w:r>
+    </w:p>
+    <w:p>
+      <w:pPr>
+        <w:pStyle w:val="BodyText"/>
+      </w:pPr>
+      <w:r>
+        <w:t xml:space="preserve">The</w:t>
+      </w:r>
+      <w:r>
+        <w:t xml:space="preserve"> </w:t>
+      </w:r>
+      <w:r>
+        <w:rPr>
+          <w:rStyle w:val="VerbatimChar"/>
+        </w:rPr>
+        <w:t xml:space="preserve">routes</w:t>
+      </w:r>
+      <w:r>
+        <w:t xml:space="preserve"> </w:t>
+      </w:r>
+      <w:r>
+        <w:t xml:space="preserve">sub-list was restored, with the</w:t>
+      </w:r>
+      <w:r>
+        <w:t xml:space="preserve"> </w:t>
+      </w:r>
+      <w:r>
+        <w:rPr>
+          <w:rStyle w:val="VerbatimChar"/>
+        </w:rPr>
+        <w:t xml:space="preserve">null</w:t>
+      </w:r>
+      <w:r>
+        <w:t xml:space="preserve"> </w:t>
+      </w:r>
+      <w:r>
+        <w:t xml:space="preserve">receiver declared explicitly. This is also the correct configuration on its own merits:</w:t>
+      </w:r>
+      <w:r>
+        <w:t xml:space="preserve"> </w:t>
+      </w:r>
+      <w:r>
+        <w:rPr>
+          <w:rStyle w:val="VerbatimChar"/>
+        </w:rPr>
+        <w:t xml:space="preserve">Watchdog</w:t>
+      </w:r>
+      <w:r>
+        <w:t xml:space="preserve"> </w:t>
+      </w:r>
+      <w:r>
+        <w:t xml:space="preserve">is a dead-man’s switch that fires continuously by design, and forwarding it to SOAR every thirty seconds would bury real alerts.</w:t>
+      </w:r>
+    </w:p>
+    <w:p>
+      <w:pPr>
+        <w:pStyle w:val="BodyText"/>
+      </w:pPr>
+      <w:r>
+        <w:t xml:space="preserve">The verification step now asserts that each expected component is</w:t>
+      </w:r>
+      <w:r>
+        <w:t xml:space="preserve"> </w:t>
+      </w:r>
+      <w:r>
+        <w:rPr>
+          <w:bCs/>
+          <w:b/>
+        </w:rPr>
+        <w:t xml:space="preserve">present</w:t>
+      </w:r>
+      <w:r>
+        <w:t xml:space="preserve">, by name, rather than only that whatever is present is healthy.</w:t>
+      </w:r>
+    </w:p>
+    <w:p>
+      <w:pPr>
+        <w:pStyle w:val="BodyText"/>
+      </w:pPr>
+      <w:r>
+        <w:t xml:space="preserve">It also reads the Alertmanager</w:t>
+      </w:r>
+      <w:r>
+        <w:t xml:space="preserve"> </w:t>
+      </w:r>
+      <w:r>
+        <w:rPr>
+          <w:rStyle w:val="VerbatimChar"/>
+        </w:rPr>
+        <w:t xml:space="preserve">Reconciled</w:t>
+      </w:r>
+      <w:r>
+        <w:t xml:space="preserve"> </w:t>
+      </w:r>
+      <w:r>
+        <w:t xml:space="preserve">condition directly, because the operator reports a rejected configuration there rather than in pod status, and separately queries the running Alertmanager to confirm the SOAR receiver is actually loaded.</w:t>
+      </w:r>
+    </w:p>
+    <w:p>
+      <w:pPr>
+        <w:pStyle w:val="BodyText"/>
+      </w:pPr>
+      <w:r>
+        <w:rPr>
+          <w:bCs/>
+          <w:b/>
+        </w:rPr>
+        <w:t xml:space="preserve">The pattern, for the fourth time.</w:t>
+      </w:r>
+      <w:r>
+        <w:t xml:space="preserve"> </w:t>
+      </w:r>
+      <w:r>
+        <w:t xml:space="preserve">The forwarder crash-looping while logging that it was healthy, the ECR token expiring until the next pull, the dashboard rendering with no data, and now a component that was never created. None produced an error anywhere an operator would look. Every check in this project that was worth adding was added after something failed quietly, and the checks that existed beforehand all verified that the things which existed were working.</w:t>
+      </w:r>
+    </w:p>
+    <w:bookmarkEnd w:id="83"/>
+    <w:bookmarkEnd w:id="84"/>
+    <w:bookmarkStart w:id="89" w:name="findings"/>
+    <w:p>
+      <w:pPr>
+        <w:pStyle w:val="Heading1"/>
+      </w:pPr>
+      <w:r>
+        <w:t xml:space="preserve">6. Findings</w:t>
+      </w:r>
+    </w:p>
+    <w:bookmarkStart w:id="85" w:name="Xfdb6ed71c42ae54ad0981a45c4700a6260775ac"/>
+    <w:p>
+      <w:pPr>
+        <w:pStyle w:val="Heading2"/>
+      </w:pPr>
+      <w:r>
+        <w:t xml:space="preserve">6.1 Read permissions do not imply write permissions</w:t>
+      </w:r>
+    </w:p>
+    <w:p>
+      <w:pPr>
+        <w:pStyle w:val="FirstParagraph"/>
+      </w:pPr>
+      <w:r>
+        <w:t xml:space="preserve">The capability probe tested</w:t>
+      </w:r>
+      <w:r>
+        <w:t xml:space="preserve"> </w:t>
+      </w:r>
+      <w:r>
+        <w:rPr>
+          <w:rStyle w:val="VerbatimChar"/>
+        </w:rPr>
+        <w:t xml:space="preserve">Describe*</w:t>
+      </w:r>
+      <w:r>
+        <w:t xml:space="preserve"> </w:t>
+      </w:r>
+      <w:r>
+        <w:t xml:space="preserve">actions and inferred service availability. The SCP denies</w:t>
+      </w:r>
+      <w:r>
+        <w:t xml:space="preserve"> </w:t>
+      </w:r>
+      <w:r>
+        <w:rPr>
+          <w:rStyle w:val="VerbatimChar"/>
+        </w:rPr>
+        <w:t xml:space="preserve">rds:CreateDBInstance</w:t>
+      </w:r>
+      <w:r>
+        <w:t xml:space="preserve"> </w:t>
+      </w:r>
+      <w:r>
+        <w:t xml:space="preserve">while permitting</w:t>
+      </w:r>
+      <w:r>
+        <w:t xml:space="preserve"> </w:t>
+      </w:r>
+      <w:r>
+        <w:rPr>
+          <w:rStyle w:val="VerbatimChar"/>
+        </w:rPr>
+        <w:t xml:space="preserve">rds:DescribeDBInstances</w:t>
+      </w:r>
+      <w:r>
+        <w:t xml:space="preserve">, so RDS appeared available and was not.</w:t>
+      </w:r>
+    </w:p>
+    <w:p>
+      <w:pPr>
+        <w:pStyle w:val="BodyText"/>
+      </w:pPr>
+      <w:r>
+        <w:t xml:space="preserve">Discovered mid-deployment, costing an unplanned redesign of the data layer.</w:t>
+      </w:r>
+    </w:p>
+    <w:p>
+      <w:pPr>
+        <w:pStyle w:val="BodyText"/>
+      </w:pPr>
+      <w:r>
+        <w:rPr>
+          <w:bCs/>
+          <w:b/>
+        </w:rPr>
         <w:t xml:space="preserve">Lesson.</w:t>
       </w:r>
       <w:r>
         <w:t xml:space="preserve"> </w:t>
       </w:r>
       <w:r>
+        <w:t xml:space="preserve">Probe with the action you intend to use.</w:t>
+      </w:r>
+      <w:r>
+        <w:t xml:space="preserve"> </w:t>
+      </w:r>
+      <w:r>
+        <w:rPr>
+          <w:rStyle w:val="VerbatimChar"/>
+        </w:rPr>
+        <w:t xml:space="preserve">--dry-run</w:t>
+      </w:r>
+      <w:r>
+        <w:t xml:space="preserve"> </w:t>
+      </w:r>
+      <w:r>
+        <w:t xml:space="preserve">where the API supports it; a create-then-delete probe where it does not. This was subsequently applied to Transit Gateway, VPC and Elastic IP creation before relying on any of them.</w:t>
+      </w:r>
+    </w:p>
+    <w:bookmarkEnd w:id="85"/>
+    <w:bookmarkStart w:id="86" w:name="X238f44773f54e3893890ae9e8b0ffa8c4ec93d3"/>
+    <w:p>
+      <w:pPr>
+        <w:pStyle w:val="Heading2"/>
+      </w:pPr>
+      <w:r>
+        <w:t xml:space="preserve">6.2 A constraint produced a better architecture</w:t>
+      </w:r>
+    </w:p>
+    <w:p>
+      <w:pPr>
+        <w:pStyle w:val="FirstParagraph"/>
+      </w:pPr>
+      <w:r>
+        <w:t xml:space="preserve">The RDS denial forced monitoring data onto S3 and SOAR state onto DynamoDB.</w:t>
+      </w:r>
+    </w:p>
+    <w:p>
+      <w:pPr>
+        <w:pStyle w:val="BodyText"/>
+      </w:pPr>
+      <w:r>
+        <w:t xml:space="preserve">The result is better than the original design. Object storage is what production observability deployments actually use for retention. Durability is far higher than a single database instance, capacity planning disappears, and retention becomes a lifecycle rule. DynamoDB suits the SOAR event workload better than a relational store, because events are written once and read by key with no joins.</w:t>
+      </w:r>
+    </w:p>
+    <w:p>
+      <w:pPr>
+        <w:pStyle w:val="BodyText"/>
+      </w:pPr>
+      <w:r>
+        <w:rPr>
+          <w:bCs/>
+          <w:b/>
+        </w:rPr>
+        <w:t xml:space="preserve">Lesson.</w:t>
+      </w:r>
+      <w:r>
+        <w:t xml:space="preserve"> </w:t>
+      </w:r>
+      <w:r>
         <w:t xml:space="preserve">A constraint is worth interrogating before it is worked around. The workaround here was better than the plan.</w:t>
       </w:r>
     </w:p>
-    <w:bookmarkEnd w:id="85"/>
-    <w:bookmarkStart w:id="86" w:name="bootstrap-ordering-is-a-real-dependency"/>
+    <w:bookmarkEnd w:id="86"/>
+    <w:bookmarkStart w:id="87" w:name="bootstrap-ordering-is-a-real-dependency"/>
     <w:p>
       <w:pPr>
         <w:pStyle w:val="Heading2"/>
@@ -6991,8 +7348,8 @@
         <w:t xml:space="preserve">Covered in 5.2. The general form: user-data that depends on network paths created in the same apply is a race, and it fails silently rather than loudly.</w:t>
       </w:r>
     </w:p>
-    <w:bookmarkEnd w:id="86"/>
-    <w:bookmarkStart w:id="87" w:name="X23218143bcc32003f368d5d390f84428c4289fe"/>
+    <w:bookmarkEnd w:id="87"/>
+    <w:bookmarkStart w:id="88" w:name="X23218143bcc32003f368d5d390f84428c4289fe"/>
     <w:p>
       <w:pPr>
         <w:pStyle w:val="Heading2"/>
@@ -7032,9 +7389,9 @@
         <w:t xml:space="preserve">metric with a reason dimension exists so that refusals are visible in operation rather than looking like inaction.</w:t>
       </w:r>
     </w:p>
-    <w:bookmarkEnd w:id="87"/>
     <w:bookmarkEnd w:id="88"/>
-    <w:bookmarkStart w:id="89" w:name="coverage"/>
+    <w:bookmarkEnd w:id="89"/>
+    <w:bookmarkStart w:id="90" w:name="coverage"/>
     <w:p>
       <w:pPr>
         <w:pStyle w:val="Heading1"/>
@@ -7396,8 +7753,8 @@
         </w:tc>
       </w:tr>
     </w:tbl>
-    <w:bookmarkEnd w:id="89"/>
-    <w:bookmarkStart w:id="90" w:name="not-tested"/>
+    <w:bookmarkEnd w:id="90"/>
+    <w:bookmarkStart w:id="91" w:name="not-tested"/>
     <w:p>
       <w:pPr>
         <w:pStyle w:val="Heading1"/>
@@ -7696,7 +8053,7 @@
         </w:tc>
       </w:tr>
     </w:tbl>
-    <w:bookmarkEnd w:id="90"/>
+    <w:bookmarkEnd w:id="91"/>
     <w:sectPr/>
   </w:body>
 </w:document>

</xml_diff>